<commit_message>
modified:   docs/Eurorack/304-Quad-Channel-Voltage-Controlled-Mixer/Files/304-Rev.1.docx 	modified:   docs/Eurorack/304-Quad-Channel-Voltage-Controlled-Mixer/Files/304-Rev.1.pdf 	deleted:    docs/Eurorack/304-Quad-Channel-Voltage-Controlled-Mixer/Files/~$4-Rev.1.docx 	new file:   docs/Eurorack/304-Quad-Channel-Voltage-Controlled-Mixer/Images/power-header.png 	modified:   docs/Eurorack/310c-Diode-Voltage-Controlled-Filter/Files/310c-Rev.1.docx 	modified:   docs/Eurorack/310c-Diode-Voltage-Controlled-Filter/Files/310c-Rev.1.pdf 	new file:   docs/Eurorack/310c-Diode-Voltage-Controlled-Filter/Images/power-header.png 	new file:   docs/Eurorack/310c-Diode-Voltage-Controlled-Filter/Images/resonance-trim.png
</commit_message>
<xml_diff>
--- a/docs/Eurorack/304-Quad-Channel-Voltage-Controlled-Mixer/Files/304-Rev.1.docx
+++ b/docs/Eurorack/304-Quad-Channel-Voltage-Controlled-Mixer/Files/304-Rev.1.docx
@@ -490,71 +490,87 @@
           <w:rFonts w:ascii="Times New Roman" w:hAnsi="Times New Roman" w:cs="Times New Roman"/>
           <w:lang w:val="en-US"/>
         </w:rPr>
-        <w:t xml:space="preserve"> other modules connected to the same power supply. </w:t>
+        <w:t xml:space="preserve"> other modules connected to the same power supply.</w:t>
       </w:r>
     </w:p>
     <w:p>
       <w:pPr>
         <w:spacing w:line="360" w:lineRule="auto"/>
-        <w:rPr>
-          <w:rFonts w:ascii="Times New Roman" w:hAnsi="Times New Roman" w:cs="Times New Roman"/>
-          <w:lang w:val="en-US"/>
-        </w:rPr>
-      </w:pPr>
+        <w:jc w:val="center"/>
+        <w:rPr>
+          <w:rFonts w:ascii="Times New Roman" w:hAnsi="Times New Roman" w:cs="Times New Roman"/>
+          <w:lang w:val="en-US"/>
+        </w:rPr>
+      </w:pPr>
+      <w:r>
+        <w:rPr>
+          <w:rFonts w:ascii="Times New Roman" w:hAnsi="Times New Roman" w:cs="Times New Roman"/>
+          <w:noProof/>
+          <w:lang w:val="en-US"/>
+        </w:rPr>
+        <w:drawing>
+          <wp:inline distT="0" distB="0" distL="0" distR="0" wp14:anchorId="4E588C14" wp14:editId="4E499A5C">
+            <wp:extent cx="3991429" cy="1462245"/>
+            <wp:effectExtent l="0" t="0" r="0" b="0"/>
+            <wp:docPr id="1727181780" name="Picture 1"/>
+            <wp:cNvGraphicFramePr>
+              <a:graphicFrameLocks xmlns:a="http://schemas.openxmlformats.org/drawingml/2006/main" noChangeAspect="1"/>
+            </wp:cNvGraphicFramePr>
+            <a:graphic xmlns:a="http://schemas.openxmlformats.org/drawingml/2006/main">
+              <a:graphicData uri="http://schemas.openxmlformats.org/drawingml/2006/picture">
+                <pic:pic xmlns:pic="http://schemas.openxmlformats.org/drawingml/2006/picture">
+                  <pic:nvPicPr>
+                    <pic:cNvPr id="1727181780" name="Picture 1727181780"/>
+                    <pic:cNvPicPr/>
+                  </pic:nvPicPr>
+                  <pic:blipFill>
+                    <a:blip r:embed="rId7" cstate="print">
+                      <a:extLst>
+                        <a:ext uri="{28A0092B-C50C-407E-A947-70E740481C1C}">
+                          <a14:useLocalDpi xmlns:a14="http://schemas.microsoft.com/office/drawing/2010/main" val="0"/>
+                        </a:ext>
+                      </a:extLst>
+                    </a:blip>
+                    <a:stretch>
+                      <a:fillRect/>
+                    </a:stretch>
+                  </pic:blipFill>
+                  <pic:spPr>
+                    <a:xfrm>
+                      <a:off x="0" y="0"/>
+                      <a:ext cx="4042324" cy="1480890"/>
+                    </a:xfrm>
+                    <a:prstGeom prst="rect">
+                      <a:avLst/>
+                    </a:prstGeom>
+                  </pic:spPr>
+                </pic:pic>
+              </a:graphicData>
+            </a:graphic>
+          </wp:inline>
+        </w:drawing>
+      </w:r>
     </w:p>
     <w:p>
       <w:pPr>
         <w:spacing w:line="360" w:lineRule="auto"/>
-        <w:rPr>
-          <w:rFonts w:ascii="Times New Roman" w:hAnsi="Times New Roman" w:cs="Times New Roman"/>
-          <w:lang w:val="en-US"/>
-        </w:rPr>
-      </w:pPr>
-    </w:p>
-    <w:p>
-      <w:pPr>
-        <w:spacing w:line="360" w:lineRule="auto"/>
-        <w:rPr>
-          <w:rFonts w:ascii="Times New Roman" w:hAnsi="Times New Roman" w:cs="Times New Roman"/>
-          <w:lang w:val="en-US"/>
-        </w:rPr>
-      </w:pPr>
-    </w:p>
-    <w:p>
-      <w:pPr>
-        <w:spacing w:line="360" w:lineRule="auto"/>
-        <w:rPr>
-          <w:rFonts w:ascii="Times New Roman" w:hAnsi="Times New Roman" w:cs="Times New Roman"/>
-          <w:lang w:val="en-US"/>
-        </w:rPr>
-      </w:pPr>
-    </w:p>
-    <w:p>
-      <w:pPr>
-        <w:spacing w:line="360" w:lineRule="auto"/>
-        <w:rPr>
-          <w:rFonts w:ascii="Times New Roman" w:hAnsi="Times New Roman" w:cs="Times New Roman"/>
-          <w:lang w:val="en-US"/>
-        </w:rPr>
-      </w:pPr>
-    </w:p>
-    <w:p>
-      <w:pPr>
-        <w:spacing w:line="360" w:lineRule="auto"/>
-        <w:rPr>
-          <w:rFonts w:ascii="Times New Roman" w:hAnsi="Times New Roman" w:cs="Times New Roman"/>
-          <w:lang w:val="en-US"/>
-        </w:rPr>
-      </w:pPr>
-    </w:p>
-    <w:p>
-      <w:pPr>
-        <w:spacing w:line="360" w:lineRule="auto"/>
-        <w:rPr>
-          <w:rFonts w:ascii="Times New Roman" w:hAnsi="Times New Roman" w:cs="Times New Roman"/>
-          <w:lang w:val="en-US"/>
-        </w:rPr>
-      </w:pPr>
+        <w:jc w:val="center"/>
+        <w:rPr>
+          <w:rFonts w:ascii="Times New Roman" w:hAnsi="Times New Roman" w:cs="Times New Roman"/>
+          <w:i/>
+          <w:iCs/>
+          <w:lang w:val="en-US"/>
+        </w:rPr>
+      </w:pPr>
+      <w:r>
+        <w:rPr>
+          <w:rFonts w:ascii="Times New Roman" w:hAnsi="Times New Roman" w:cs="Times New Roman"/>
+          <w:i/>
+          <w:iCs/>
+          <w:lang w:val="en-US"/>
+        </w:rPr>
+        <w:t>fig. 2.1 Power Connector</w:t>
+      </w:r>
     </w:p>
     <w:p>
       <w:pPr>
@@ -600,7 +616,7 @@
                     <pic:cNvPicPr/>
                   </pic:nvPicPr>
                   <pic:blipFill rotWithShape="1">
-                    <a:blip r:embed="rId7" cstate="print">
+                    <a:blip r:embed="rId8" cstate="print">
                       <a:extLst>
                         <a:ext uri="{28A0092B-C50C-407E-A947-70E740481C1C}">
                           <a14:useLocalDpi xmlns:a14="http://schemas.microsoft.com/office/drawing/2010/main" val="0"/>
@@ -679,7 +695,23 @@
           <w:rFonts w:ascii="Times New Roman" w:hAnsi="Times New Roman" w:cs="Times New Roman"/>
           <w:lang w:val="en-US"/>
         </w:rPr>
-        <w:t xml:space="preserve"> lacks labels and text, but is still </w:t>
+        <w:t xml:space="preserve"> lacks labels and </w:t>
+      </w:r>
+      <w:proofErr w:type="gramStart"/>
+      <w:r>
+        <w:rPr>
+          <w:rFonts w:ascii="Times New Roman" w:hAnsi="Times New Roman" w:cs="Times New Roman"/>
+          <w:lang w:val="en-US"/>
+        </w:rPr>
+        <w:t>text, but</w:t>
+      </w:r>
+      <w:proofErr w:type="gramEnd"/>
+      <w:r>
+        <w:rPr>
+          <w:rFonts w:ascii="Times New Roman" w:hAnsi="Times New Roman" w:cs="Times New Roman"/>
+          <w:lang w:val="en-US"/>
+        </w:rPr>
+        <w:t xml:space="preserve"> is still </w:t>
       </w:r>
       <w:proofErr w:type="gramStart"/>
       <w:r>
@@ -1003,7 +1035,7 @@
                     <pic:cNvPicPr/>
                   </pic:nvPicPr>
                   <pic:blipFill>
-                    <a:blip r:embed="rId8" cstate="print">
+                    <a:blip r:embed="rId9" cstate="print">
                       <a:extLst>
                         <a:ext uri="{28A0092B-C50C-407E-A947-70E740481C1C}">
                           <a14:useLocalDpi xmlns:a14="http://schemas.microsoft.com/office/drawing/2010/main" val="0"/>
@@ -1130,7 +1162,7 @@
           <w:u w:val="single"/>
           <w:lang w:val="en-US"/>
         </w:rPr>
-        <w:t xml:space="preserve"> Patch Ideas</w:t>
+        <w:t xml:space="preserve"> Technical Specifications</w:t>
       </w:r>
     </w:p>
     <w:p>
@@ -1138,132 +1170,28 @@
         <w:spacing w:line="360" w:lineRule="auto"/>
         <w:rPr>
           <w:rFonts w:ascii="Times New Roman" w:hAnsi="Times New Roman" w:cs="Times New Roman"/>
-          <w:lang w:val="en-US"/>
-        </w:rPr>
-      </w:pPr>
-    </w:p>
-    <w:p>
-      <w:pPr>
-        <w:spacing w:line="360" w:lineRule="auto"/>
-        <w:rPr>
-          <w:rFonts w:ascii="Times New Roman" w:hAnsi="Times New Roman" w:cs="Times New Roman"/>
-          <w:lang w:val="en-US"/>
-        </w:rPr>
-      </w:pPr>
-    </w:p>
-    <w:p>
-      <w:pPr>
-        <w:spacing w:line="360" w:lineRule="auto"/>
-        <w:rPr>
-          <w:rFonts w:ascii="Times New Roman" w:hAnsi="Times New Roman" w:cs="Times New Roman"/>
-          <w:lang w:val="en-US"/>
-        </w:rPr>
-      </w:pPr>
-    </w:p>
-    <w:p>
-      <w:pPr>
-        <w:spacing w:line="360" w:lineRule="auto"/>
-        <w:rPr>
-          <w:rFonts w:ascii="Times New Roman" w:hAnsi="Times New Roman" w:cs="Times New Roman"/>
-          <w:lang w:val="en-US"/>
-        </w:rPr>
-      </w:pPr>
-    </w:p>
-    <w:p>
-      <w:pPr>
-        <w:spacing w:line="360" w:lineRule="auto"/>
-        <w:rPr>
-          <w:rFonts w:ascii="Times New Roman" w:hAnsi="Times New Roman" w:cs="Times New Roman"/>
-          <w:lang w:val="en-US"/>
-        </w:rPr>
-      </w:pPr>
-    </w:p>
-    <w:p>
-      <w:pPr>
-        <w:spacing w:line="360" w:lineRule="auto"/>
-        <w:rPr>
-          <w:rFonts w:ascii="Times New Roman" w:hAnsi="Times New Roman" w:cs="Times New Roman"/>
-          <w:lang w:val="en-US"/>
-        </w:rPr>
-      </w:pPr>
-    </w:p>
-    <w:p>
-      <w:pPr>
-        <w:spacing w:line="360" w:lineRule="auto"/>
-        <w:rPr>
-          <w:rFonts w:ascii="Times New Roman" w:hAnsi="Times New Roman" w:cs="Times New Roman"/>
-          <w:lang w:val="en-US"/>
-        </w:rPr>
-      </w:pPr>
-    </w:p>
-    <w:p>
-      <w:pPr>
-        <w:spacing w:line="360" w:lineRule="auto"/>
-        <w:rPr>
-          <w:rFonts w:ascii="Times New Roman" w:hAnsi="Times New Roman" w:cs="Times New Roman"/>
-          <w:lang w:val="en-US"/>
-        </w:rPr>
-      </w:pPr>
-    </w:p>
-    <w:p>
-      <w:pPr>
-        <w:spacing w:line="360" w:lineRule="auto"/>
-        <w:rPr>
-          <w:rFonts w:ascii="Times New Roman" w:hAnsi="Times New Roman" w:cs="Times New Roman"/>
-          <w:lang w:val="en-US"/>
-        </w:rPr>
-      </w:pPr>
-    </w:p>
-    <w:p>
-      <w:pPr>
-        <w:spacing w:line="360" w:lineRule="auto"/>
-        <w:rPr>
-          <w:rFonts w:ascii="Times New Roman" w:hAnsi="Times New Roman" w:cs="Times New Roman"/>
-          <w:b/>
-          <w:bCs/>
-          <w:u w:val="single"/>
-          <w:lang w:val="en-US"/>
-        </w:rPr>
-      </w:pPr>
-      <w:r>
-        <w:rPr>
-          <w:rFonts w:ascii="Times New Roman" w:hAnsi="Times New Roman" w:cs="Times New Roman"/>
-          <w:b/>
-          <w:bCs/>
-          <w:u w:val="single"/>
-          <w:lang w:val="en-US"/>
-        </w:rPr>
-        <w:t>6</w:t>
-      </w:r>
-      <w:r>
-        <w:rPr>
-          <w:rFonts w:ascii="Times New Roman" w:hAnsi="Times New Roman" w:cs="Times New Roman"/>
-          <w:b/>
-          <w:bCs/>
-          <w:u w:val="single"/>
-          <w:lang w:val="en-US"/>
-        </w:rPr>
-        <w:t xml:space="preserve"> Technical Specifications</w:t>
-      </w:r>
-    </w:p>
-    <w:p>
-      <w:pPr>
-        <w:spacing w:line="360" w:lineRule="auto"/>
-        <w:rPr>
-          <w:rFonts w:ascii="Times New Roman" w:hAnsi="Times New Roman" w:cs="Times New Roman"/>
-          <w:b/>
-          <w:bCs/>
-          <w:lang w:val="en-US"/>
-        </w:rPr>
-      </w:pPr>
-      <w:r>
-        <w:rPr>
-          <w:rFonts w:ascii="Times New Roman" w:hAnsi="Times New Roman" w:cs="Times New Roman"/>
-          <w:b/>
-          <w:bCs/>
-          <w:lang w:val="en-US"/>
-        </w:rPr>
-        <w:t>6.1 Dimensions &amp; Power</w:t>
+          <w:b/>
+          <w:bCs/>
+          <w:lang w:val="en-US"/>
+        </w:rPr>
+      </w:pPr>
+      <w:r>
+        <w:rPr>
+          <w:rFonts w:ascii="Times New Roman" w:hAnsi="Times New Roman" w:cs="Times New Roman"/>
+          <w:b/>
+          <w:bCs/>
+          <w:lang w:val="en-US"/>
+        </w:rPr>
+        <w:t>5</w:t>
+      </w:r>
+      <w:r>
+        <w:rPr>
+          <w:rFonts w:ascii="Times New Roman" w:hAnsi="Times New Roman" w:cs="Times New Roman"/>
+          <w:b/>
+          <w:bCs/>
+          <w:lang w:val="en-US"/>
+        </w:rPr>
+        <w:t>.1 Dimensions &amp; Power</w:t>
       </w:r>
     </w:p>
     <w:tbl>
@@ -1530,7 +1458,16 @@
           <w:bCs/>
           <w:lang w:val="en-US"/>
         </w:rPr>
-        <w:t>6.2 Inputs &amp; Outputs</w:t>
+        <w:t>5</w:t>
+      </w:r>
+      <w:r>
+        <w:rPr>
+          <w:rFonts w:ascii="Times New Roman" w:hAnsi="Times New Roman" w:cs="Times New Roman"/>
+          <w:b/>
+          <w:bCs/>
+          <w:lang w:val="en-US"/>
+        </w:rPr>
+        <w:t>.2 Inputs &amp; Outputs</w:t>
       </w:r>
     </w:p>
     <w:tbl>
@@ -1617,43 +1554,70 @@
               <w:spacing w:line="360" w:lineRule="auto"/>
               <w:rPr>
                 <w:rFonts w:ascii="Times New Roman" w:hAnsi="Times New Roman" w:cs="Times New Roman"/>
+                <w:b/>
+                <w:bCs/>
                 <w:lang w:val="en-US"/>
               </w:rPr>
             </w:pPr>
             <w:r>
               <w:rPr>
                 <w:rFonts w:ascii="Times New Roman" w:hAnsi="Times New Roman" w:cs="Times New Roman"/>
+                <w:b/>
+                <w:bCs/>
                 <w:lang w:val="en-US"/>
               </w:rPr>
-              <w:t>I</w:t>
-            </w:r>
-            <w:r>
-              <w:rPr>
-                <w:rFonts w:ascii="Times New Roman" w:hAnsi="Times New Roman" w:cs="Times New Roman"/>
-                <w:lang w:val="en-US"/>
-              </w:rPr>
-              <w:t>nput name</w:t>
+              <w:t>IN 1 - 4</w:t>
             </w:r>
           </w:p>
         </w:tc>
         <w:tc>
           <w:tcPr>
             <w:tcW w:w="2337" w:type="dxa"/>
+            <w:vMerge w:val="restart"/>
           </w:tcPr>
           <w:p>
             <w:pPr>
               <w:spacing w:line="360" w:lineRule="auto"/>
               <w:rPr>
                 <w:rFonts w:ascii="Times New Roman" w:hAnsi="Times New Roman" w:cs="Times New Roman"/>
+                <w:i/>
+                <w:iCs/>
                 <w:lang w:val="en-US"/>
               </w:rPr>
             </w:pPr>
             <w:r>
               <w:rPr>
                 <w:rFonts w:ascii="Times New Roman" w:hAnsi="Times New Roman" w:cs="Times New Roman"/>
+                <w:i/>
+                <w:iCs/>
                 <w:lang w:val="en-US"/>
               </w:rPr>
-              <w:t>Additional info</w:t>
+              <w:t>Any modular signal levels</w:t>
+            </w:r>
+          </w:p>
+        </w:tc>
+        <w:tc>
+          <w:tcPr>
+            <w:tcW w:w="2338" w:type="dxa"/>
+          </w:tcPr>
+          <w:p>
+            <w:pPr>
+              <w:spacing w:line="360" w:lineRule="auto"/>
+              <w:rPr>
+                <w:rFonts w:ascii="Times New Roman" w:hAnsi="Times New Roman" w:cs="Times New Roman"/>
+                <w:b/>
+                <w:bCs/>
+                <w:lang w:val="en-US"/>
+              </w:rPr>
+            </w:pPr>
+            <w:r>
+              <w:rPr>
+                <w:rFonts w:ascii="Times New Roman" w:hAnsi="Times New Roman" w:cs="Times New Roman"/>
+                <w:b/>
+                <w:bCs/>
+                <w:lang w:val="en-US"/>
+              </w:rPr>
+              <w:t>OUT 1 - 4</w:t>
             </w:r>
           </w:p>
         </w:tc>
@@ -1672,37 +1636,31 @@
             <w:r>
               <w:rPr>
                 <w:rFonts w:ascii="Times New Roman" w:hAnsi="Times New Roman" w:cs="Times New Roman"/>
+                <w:i/>
+                <w:iCs/>
                 <w:lang w:val="en-US"/>
               </w:rPr>
-              <w:t>output</w:t>
+              <w:t xml:space="preserve">~20 </w:t>
             </w:r>
+            <w:proofErr w:type="spellStart"/>
             <w:r>
               <w:rPr>
                 <w:rFonts w:ascii="Times New Roman" w:hAnsi="Times New Roman" w:cs="Times New Roman"/>
+                <w:i/>
+                <w:iCs/>
                 <w:lang w:val="en-US"/>
               </w:rPr>
-              <w:t xml:space="preserve"> name</w:t>
+              <w:t>Vpp</w:t>
             </w:r>
-          </w:p>
-        </w:tc>
-        <w:tc>
-          <w:tcPr>
-            <w:tcW w:w="2338" w:type="dxa"/>
-          </w:tcPr>
-          <w:p>
-            <w:pPr>
-              <w:spacing w:line="360" w:lineRule="auto"/>
-              <w:rPr>
-                <w:rFonts w:ascii="Times New Roman" w:hAnsi="Times New Roman" w:cs="Times New Roman"/>
-                <w:lang w:val="en-US"/>
-              </w:rPr>
-            </w:pPr>
+            <w:proofErr w:type="spellEnd"/>
             <w:r>
               <w:rPr>
                 <w:rFonts w:ascii="Times New Roman" w:hAnsi="Times New Roman" w:cs="Times New Roman"/>
+                <w:i/>
+                <w:iCs/>
                 <w:lang w:val="en-US"/>
               </w:rPr>
-              <w:t>Additional info</w:t>
+              <w:t xml:space="preserve"> max.</w:t>
             </w:r>
           </w:p>
         </w:tc>
@@ -1717,14 +1675,26 @@
               <w:spacing w:line="360" w:lineRule="auto"/>
               <w:rPr>
                 <w:rFonts w:ascii="Times New Roman" w:hAnsi="Times New Roman" w:cs="Times New Roman"/>
+                <w:b/>
+                <w:bCs/>
                 <w:lang w:val="en-US"/>
               </w:rPr>
             </w:pPr>
+            <w:r>
+              <w:rPr>
+                <w:rFonts w:ascii="Times New Roman" w:hAnsi="Times New Roman" w:cs="Times New Roman"/>
+                <w:b/>
+                <w:bCs/>
+                <w:lang w:val="en-US"/>
+              </w:rPr>
+              <w:t>CV 1 - 4</w:t>
+            </w:r>
           </w:p>
         </w:tc>
         <w:tc>
           <w:tcPr>
             <w:tcW w:w="2337" w:type="dxa"/>
+            <w:vMerge/>
           </w:tcPr>
           <w:p>
             <w:pPr>
@@ -1738,79 +1708,8 @@
         </w:tc>
         <w:tc>
           <w:tcPr>
-            <w:tcW w:w="2338" w:type="dxa"/>
-          </w:tcPr>
-          <w:p>
-            <w:pPr>
-              <w:spacing w:line="360" w:lineRule="auto"/>
-              <w:rPr>
-                <w:rFonts w:ascii="Times New Roman" w:hAnsi="Times New Roman" w:cs="Times New Roman"/>
-                <w:lang w:val="en-US"/>
-              </w:rPr>
-            </w:pPr>
-          </w:p>
-        </w:tc>
-        <w:tc>
-          <w:tcPr>
-            <w:tcW w:w="2338" w:type="dxa"/>
-          </w:tcPr>
-          <w:p>
-            <w:pPr>
-              <w:spacing w:line="360" w:lineRule="auto"/>
-              <w:rPr>
-                <w:rFonts w:ascii="Times New Roman" w:hAnsi="Times New Roman" w:cs="Times New Roman"/>
-                <w:lang w:val="en-US"/>
-              </w:rPr>
-            </w:pPr>
-          </w:p>
-        </w:tc>
-      </w:tr>
-      <w:tr>
-        <w:tc>
-          <w:tcPr>
-            <w:tcW w:w="2337" w:type="dxa"/>
-          </w:tcPr>
-          <w:p>
-            <w:pPr>
-              <w:spacing w:line="360" w:lineRule="auto"/>
-              <w:rPr>
-                <w:rFonts w:ascii="Times New Roman" w:hAnsi="Times New Roman" w:cs="Times New Roman"/>
-                <w:lang w:val="en-US"/>
-              </w:rPr>
-            </w:pPr>
-          </w:p>
-        </w:tc>
-        <w:tc>
-          <w:tcPr>
-            <w:tcW w:w="2337" w:type="dxa"/>
-          </w:tcPr>
-          <w:p>
-            <w:pPr>
-              <w:spacing w:line="360" w:lineRule="auto"/>
-              <w:rPr>
-                <w:rFonts w:ascii="Times New Roman" w:hAnsi="Times New Roman" w:cs="Times New Roman"/>
-                <w:lang w:val="en-US"/>
-              </w:rPr>
-            </w:pPr>
-          </w:p>
-        </w:tc>
-        <w:tc>
-          <w:tcPr>
-            <w:tcW w:w="2338" w:type="dxa"/>
-          </w:tcPr>
-          <w:p>
-            <w:pPr>
-              <w:spacing w:line="360" w:lineRule="auto"/>
-              <w:rPr>
-                <w:rFonts w:ascii="Times New Roman" w:hAnsi="Times New Roman" w:cs="Times New Roman"/>
-                <w:lang w:val="en-US"/>
-              </w:rPr>
-            </w:pPr>
-          </w:p>
-        </w:tc>
-        <w:tc>
-          <w:tcPr>
-            <w:tcW w:w="2338" w:type="dxa"/>
+            <w:tcW w:w="4676" w:type="dxa"/>
+            <w:gridSpan w:val="2"/>
           </w:tcPr>
           <w:p>
             <w:pPr>
@@ -1852,13 +1751,21 @@
           <w:bCs/>
           <w:lang w:val="en-US"/>
         </w:rPr>
-        <w:lastRenderedPageBreak/>
-        <w:t>6.3 Other Specifications</w:t>
+        <w:t>5</w:t>
+      </w:r>
+      <w:r>
+        <w:rPr>
+          <w:rFonts w:ascii="Times New Roman" w:hAnsi="Times New Roman" w:cs="Times New Roman"/>
+          <w:b/>
+          <w:bCs/>
+          <w:lang w:val="en-US"/>
+        </w:rPr>
+        <w:t>.3 Other Specifications</w:t>
       </w:r>
     </w:p>
     <w:sectPr>
-      <w:footerReference w:type="even" r:id="rId9"/>
-      <w:footerReference w:type="default" r:id="rId10"/>
+      <w:footerReference w:type="even" r:id="rId10"/>
+      <w:footerReference w:type="default" r:id="rId11"/>
       <w:pgSz w:w="12240" w:h="15840"/>
       <w:pgMar w:top="1440" w:right="1440" w:bottom="1440" w:left="1440" w:header="708" w:footer="708" w:gutter="0"/>
       <w:cols w:space="708"/>

</xml_diff>